<commit_message>
Lab05: update report files
</commit_message>
<xml_diff>
--- a/Labs_5/Lab05.docx
+++ b/Labs_5/Lab05.docx
@@ -40,6 +40,18 @@
         </w:rPr>
         <w:t xml:space="preserve">Link Github: </w:t>
       </w:r>
+      <w:hyperlink r:id="rId4" w:history="1">
+        <w:r>
+          <w:rPr>
+            <w:rStyle w:val="Hyperlink"/>
+            <w:b/>
+            <w:bCs/>
+            <w:sz w:val="28"/>
+            <w:szCs w:val="28"/>
+          </w:rPr>
+          <w:t>https://github.com/tin1508/Asp.Net_TTH/tree/Lab05/Labs_5</w:t>
+        </w:r>
+      </w:hyperlink>
     </w:p>
     <w:p>
       <w:pPr>
@@ -103,6 +115,7 @@
         <w:rPr>
           <w:b/>
           <w:bCs/>
+          <w:noProof/>
           <w:sz w:val="28"/>
           <w:szCs w:val="28"/>
         </w:rPr>
@@ -122,7 +135,7 @@
                     <pic:cNvPicPr/>
                   </pic:nvPicPr>
                   <pic:blipFill>
-                    <a:blip r:embed="rId4"/>
+                    <a:blip r:embed="rId5"/>
                     <a:stretch>
                       <a:fillRect/>
                     </a:stretch>
@@ -175,6 +188,7 @@
         <w:rPr>
           <w:b/>
           <w:bCs/>
+          <w:noProof/>
           <w:sz w:val="28"/>
           <w:szCs w:val="28"/>
         </w:rPr>
@@ -194,7 +208,7 @@
                     <pic:cNvPicPr/>
                   </pic:nvPicPr>
                   <pic:blipFill>
-                    <a:blip r:embed="rId5"/>
+                    <a:blip r:embed="rId6"/>
                     <a:stretch>
                       <a:fillRect/>
                     </a:stretch>
@@ -278,6 +292,7 @@
         <w:rPr>
           <w:b/>
           <w:bCs/>
+          <w:noProof/>
           <w:sz w:val="28"/>
           <w:szCs w:val="28"/>
         </w:rPr>
@@ -297,7 +312,7 @@
                     <pic:cNvPicPr/>
                   </pic:nvPicPr>
                   <pic:blipFill>
-                    <a:blip r:embed="rId6"/>
+                    <a:blip r:embed="rId7"/>
                     <a:stretch>
                       <a:fillRect/>
                     </a:stretch>
@@ -359,6 +374,7 @@
         <w:rPr>
           <w:b/>
           <w:bCs/>
+          <w:noProof/>
           <w:sz w:val="28"/>
           <w:szCs w:val="28"/>
         </w:rPr>
@@ -378,7 +394,7 @@
                     <pic:cNvPicPr/>
                   </pic:nvPicPr>
                   <pic:blipFill>
-                    <a:blip r:embed="rId7"/>
+                    <a:blip r:embed="rId8"/>
                     <a:stretch>
                       <a:fillRect/>
                     </a:stretch>
@@ -446,6 +462,7 @@
         <w:rPr>
           <w:b/>
           <w:bCs/>
+          <w:noProof/>
           <w:sz w:val="28"/>
           <w:szCs w:val="28"/>
         </w:rPr>
@@ -474,7 +491,7 @@
                     <pic:cNvPicPr/>
                   </pic:nvPicPr>
                   <pic:blipFill>
-                    <a:blip r:embed="rId8">
+                    <a:blip r:embed="rId9">
                       <a:extLst>
                         <a:ext uri="{28A0092B-C50C-407E-A947-70E740481C1C}">
                           <a14:useLocalDpi xmlns:a14="http://schemas.microsoft.com/office/drawing/2010/main" val="0"/>
@@ -510,6 +527,7 @@
         <w:rPr>
           <w:b/>
           <w:bCs/>
+          <w:noProof/>
           <w:sz w:val="28"/>
           <w:szCs w:val="28"/>
         </w:rPr>
@@ -529,7 +547,7 @@
                     <pic:cNvPicPr/>
                   </pic:nvPicPr>
                   <pic:blipFill>
-                    <a:blip r:embed="rId9"/>
+                    <a:blip r:embed="rId10"/>
                     <a:stretch>
                       <a:fillRect/>
                     </a:stretch>
@@ -657,6 +675,7 @@
         <w:rPr>
           <w:b/>
           <w:bCs/>
+          <w:noProof/>
           <w:sz w:val="28"/>
           <w:szCs w:val="28"/>
         </w:rPr>
@@ -676,7 +695,7 @@
                     <pic:cNvPicPr/>
                   </pic:nvPicPr>
                   <pic:blipFill>
-                    <a:blip r:embed="rId10"/>
+                    <a:blip r:embed="rId11"/>
                     <a:stretch>
                       <a:fillRect/>
                     </a:stretch>
@@ -734,6 +753,7 @@
         <w:rPr>
           <w:b/>
           <w:bCs/>
+          <w:noProof/>
           <w:sz w:val="28"/>
           <w:szCs w:val="28"/>
         </w:rPr>
@@ -754,7 +774,7 @@
                     <pic:cNvPicPr/>
                   </pic:nvPicPr>
                   <pic:blipFill>
-                    <a:blip r:embed="rId11"/>
+                    <a:blip r:embed="rId12"/>
                     <a:stretch>
                       <a:fillRect/>
                     </a:stretch>
@@ -807,6 +827,7 @@
         <w:rPr>
           <w:b/>
           <w:bCs/>
+          <w:noProof/>
           <w:sz w:val="28"/>
           <w:szCs w:val="28"/>
         </w:rPr>
@@ -826,7 +847,7 @@
                     <pic:cNvPicPr/>
                   </pic:nvPicPr>
                   <pic:blipFill>
-                    <a:blip r:embed="rId12"/>
+                    <a:blip r:embed="rId13"/>
                     <a:stretch>
                       <a:fillRect/>
                     </a:stretch>
@@ -907,6 +928,7 @@
         <w:rPr>
           <w:b/>
           <w:bCs/>
+          <w:noProof/>
           <w:sz w:val="28"/>
           <w:szCs w:val="28"/>
         </w:rPr>
@@ -926,7 +948,7 @@
                     <pic:cNvPicPr/>
                   </pic:nvPicPr>
                   <pic:blipFill>
-                    <a:blip r:embed="rId13"/>
+                    <a:blip r:embed="rId14"/>
                     <a:stretch>
                       <a:fillRect/>
                     </a:stretch>
@@ -975,6 +997,7 @@
       </w:pPr>
       <w:r>
         <w:rPr>
+          <w:noProof/>
           <w:sz w:val="28"/>
           <w:szCs w:val="28"/>
         </w:rPr>
@@ -994,7 +1017,7 @@
                     <pic:cNvPicPr/>
                   </pic:nvPicPr>
                   <pic:blipFill>
-                    <a:blip r:embed="rId14"/>
+                    <a:blip r:embed="rId15"/>
                     <a:stretch>
                       <a:fillRect/>
                     </a:stretch>
@@ -1067,6 +1090,7 @@
         <w:rPr>
           <w:b/>
           <w:bCs/>
+          <w:noProof/>
           <w:sz w:val="28"/>
           <w:szCs w:val="28"/>
         </w:rPr>
@@ -1086,7 +1110,7 @@
                     <pic:cNvPicPr/>
                   </pic:nvPicPr>
                   <pic:blipFill>
-                    <a:blip r:embed="rId15"/>
+                    <a:blip r:embed="rId16"/>
                     <a:stretch>
                       <a:fillRect/>
                     </a:stretch>
@@ -1140,6 +1164,7 @@
       </w:pPr>
       <w:r>
         <w:rPr>
+          <w:noProof/>
           <w:sz w:val="28"/>
           <w:szCs w:val="28"/>
         </w:rPr>
@@ -1159,7 +1184,7 @@
                     <pic:cNvPicPr/>
                   </pic:nvPicPr>
                   <pic:blipFill>
-                    <a:blip r:embed="rId16"/>
+                    <a:blip r:embed="rId17"/>
                     <a:stretch>
                       <a:fillRect/>
                     </a:stretch>
@@ -1204,6 +1229,7 @@
       </w:pPr>
       <w:r>
         <w:rPr>
+          <w:noProof/>
           <w:sz w:val="28"/>
           <w:szCs w:val="28"/>
         </w:rPr>
@@ -1224,7 +1250,7 @@
                     <pic:cNvPicPr/>
                   </pic:nvPicPr>
                   <pic:blipFill>
-                    <a:blip r:embed="rId17"/>
+                    <a:blip r:embed="rId18"/>
                     <a:stretch>
                       <a:fillRect/>
                     </a:stretch>
@@ -1254,6 +1280,7 @@
       </w:pPr>
       <w:r>
         <w:rPr>
+          <w:noProof/>
           <w:sz w:val="28"/>
           <w:szCs w:val="28"/>
         </w:rPr>
@@ -1273,7 +1300,7 @@
                     <pic:cNvPicPr/>
                   </pic:nvPicPr>
                   <pic:blipFill>
-                    <a:blip r:embed="rId18"/>
+                    <a:blip r:embed="rId19"/>
                     <a:stretch>
                       <a:fillRect/>
                     </a:stretch>
@@ -1318,6 +1345,7 @@
       </w:pPr>
       <w:r>
         <w:rPr>
+          <w:noProof/>
           <w:sz w:val="28"/>
           <w:szCs w:val="28"/>
         </w:rPr>
@@ -1337,7 +1365,7 @@
                     <pic:cNvPicPr/>
                   </pic:nvPicPr>
                   <pic:blipFill>
-                    <a:blip r:embed="rId19"/>
+                    <a:blip r:embed="rId20"/>
                     <a:stretch>
                       <a:fillRect/>
                     </a:stretch>
@@ -1383,6 +1411,7 @@
       </w:pPr>
       <w:r>
         <w:rPr>
+          <w:noProof/>
           <w:sz w:val="28"/>
           <w:szCs w:val="28"/>
         </w:rPr>
@@ -1402,7 +1431,7 @@
                     <pic:cNvPicPr/>
                   </pic:nvPicPr>
                   <pic:blipFill>
-                    <a:blip r:embed="rId20"/>
+                    <a:blip r:embed="rId21"/>
                     <a:stretch>
                       <a:fillRect/>
                     </a:stretch>
@@ -1471,25 +1500,19 @@
           <w:sz w:val="28"/>
           <w:szCs w:val="28"/>
         </w:rPr>
-        <w:t>Em có tạo 1 thanh filter bar để users có thể filter bất kì sản phẩm nào mà họ muốn theo những trường dữ liệu có sẵn như: giá tối thiểu, danh mục hay theo từ khóa trong tên sản phẩm…</w:t>
-      </w:r>
-      <w:r>
-        <w:rPr>
-          <w:sz w:val="28"/>
-          <w:szCs w:val="28"/>
-        </w:rPr>
-        <w:t>Điều này sẽ giúp trực quan hơn là phải gõ tìm kiếm trên thanh url.</w:t>
-      </w:r>
-    </w:p>
-    <w:p>
-      <w:pPr>
-        <w:rPr>
-          <w:sz w:val="28"/>
-          <w:szCs w:val="28"/>
-        </w:rPr>
-      </w:pPr>
-      <w:r>
-        <w:rPr>
+        <w:t>Em có tạo 1 thanh filter bar để users có thể filter bất kì sản phẩm nào mà họ muốn theo những trường dữ liệu có sẵn như: giá tối thiểu, danh mục hay theo từ khóa trong tên sản phẩm…Điều này sẽ giúp trực quan hơn là phải gõ tìm kiếm trên thanh url.</w:t>
+      </w:r>
+    </w:p>
+    <w:p>
+      <w:pPr>
+        <w:rPr>
+          <w:sz w:val="28"/>
+          <w:szCs w:val="28"/>
+        </w:rPr>
+      </w:pPr>
+      <w:r>
+        <w:rPr>
+          <w:noProof/>
           <w:sz w:val="28"/>
           <w:szCs w:val="28"/>
         </w:rPr>
@@ -1509,7 +1532,7 @@
                     <pic:cNvPicPr/>
                   </pic:nvPicPr>
                   <pic:blipFill>
-                    <a:blip r:embed="rId21"/>
+                    <a:blip r:embed="rId22"/>
                     <a:stretch>
                       <a:fillRect/>
                     </a:stretch>
@@ -1630,6 +1653,7 @@
         <w:rPr>
           <w:b/>
           <w:bCs/>
+          <w:noProof/>
           <w:sz w:val="28"/>
           <w:szCs w:val="28"/>
         </w:rPr>
@@ -1650,7 +1674,7 @@
                     <pic:cNvPicPr/>
                   </pic:nvPicPr>
                   <pic:blipFill>
-                    <a:blip r:embed="rId5"/>
+                    <a:blip r:embed="rId6"/>
                     <a:stretch>
                       <a:fillRect/>
                     </a:stretch>
@@ -3274,6 +3298,7 @@
   <w:style w:type="character" w:default="1" w:styleId="DefaultParagraphFont">
     <w:name w:val="Default Paragraph Font"/>
     <w:uiPriority w:val="1"/>
+    <w:semiHidden/>
     <w:unhideWhenUsed/>
   </w:style>
   <w:style w:type="table" w:default="1" w:styleId="TableNormal">
@@ -3586,6 +3611,29 @@
       <w:spacing w:val="5"/>
     </w:rPr>
   </w:style>
+  <w:style w:type="character" w:styleId="Hyperlink">
+    <w:name w:val="Hyperlink"/>
+    <w:basedOn w:val="DefaultParagraphFont"/>
+    <w:uiPriority w:val="99"/>
+    <w:unhideWhenUsed/>
+    <w:rsid w:val="003224CB"/>
+    <w:rPr>
+      <w:color w:val="467886" w:themeColor="hyperlink"/>
+      <w:u w:val="single"/>
+    </w:rPr>
+  </w:style>
+  <w:style w:type="character" w:styleId="UnresolvedMention">
+    <w:name w:val="Unresolved Mention"/>
+    <w:basedOn w:val="DefaultParagraphFont"/>
+    <w:uiPriority w:val="99"/>
+    <w:semiHidden/>
+    <w:unhideWhenUsed/>
+    <w:rsid w:val="003224CB"/>
+    <w:rPr>
+      <w:color w:val="605E5C"/>
+      <w:shd w:val="clear" w:color="auto" w:fill="E1DFDD"/>
+    </w:rPr>
+  </w:style>
 </w:styles>
 </file>
 

</xml_diff>